<commit_message>
Add Chapter VII (RTP protocols) and Chapter VIII (discussion and conclusions)
Write two closing thesis chapters directly tied to the own-study
findings from Chapter VI: three model four-phase rehabilitation/RTP
protocols (ankle sprain, ACL/knee, hamstring strain) built on
criteria-based progression (PEACE & LOVE, LSI thresholds, hop tests,
Y-Balance, TSK, ACL-RSI), and a discussion/conclusions chapter
confronting H1-H5 with current literature, plus 13 new verified
bibliography entries.

Co-Authored-By: Claude Sonnet 5 <noreply@anthropic.com>
Claude-Session: https://claude.ai/code/session_01XaWshh4tdoCzCEwG2MS9Wq
</commit_message>
<xml_diff>
--- a/output/Praca_magisterska_Klapczynski_ROZDZ_IIII_VVI_z_H5.docx
+++ b/output/Praca_magisterska_Klapczynski_ROZDZ_IIII_VVI_z_H5.docx
@@ -1248,6 +1248,762 @@
     </w:p>
     <w:bookmarkEnd w:id="45"/>
     <w:bookmarkEnd w:id="46"/>
+    <w:p>
+      <w:pPr>
+        <w:pStyle w:val="Heading1"/>
+      </w:pPr>
+      <w:r>
+        <w:t xml:space="preserve">Rozdział VII. Propozycje modelowych protokołów usprawniania i kryteriów Return to Play (RTP) w najczęstszych urazach piłkarskich</w:t>
+      </w:r>
+    </w:p>
+    <w:p>
+      <w:pPr>
+        <w:pStyle w:val="FirstParagraph"/>
+      </w:pPr>
+      <w:r>
+        <w:t xml:space="preserve">Wyniki przedstawione w Rozdziale VI ujawniają wyraźną rozbieżność między współczesnymi standardami postępowania w medycynie sportowej a rzeczywistą praktyką kliniczną stosowaną wobec kontuzjowanych piłkarzy badanej grupy. Brak obiektywizacji kryteriów powrotu do gry (76,8% badanych nie przeszło żadnych testów funkcjonalnych), podejmowanie ostatecznej decyzji o </w:t>
+      </w:r>
+      <w:r>
+        <w:rPr>
+          <w:iCs/>
+          <w:i/>
+        </w:rPr>
+        <w:t xml:space="preserve">Return to Play</w:t>
+      </w:r>
+      <w:r>
+        <w:t xml:space="preserve"> samodzielnie przez zawodnika, z pominięciem personelu medycznego (58,9% przypadków), wysoka częstość i nasilenie kinezjofobii (69,6% zawodników, z istotnym wpływem na wzorzec gry u 21,4% badanych) oraz marginalne wykorzystanie treningu ekscentrycznego/izometrycznego (26,9%) stanowią bezpośrednie wskazanie do opracowania zoperacjonalizowanych protokołów usprawniania, w których progresja między kolejnymi etapami sterowana jest obiektywnymi kryteriami funkcjonalnymi, a nie wyłącznie czasem, jaki upłynął od urazu.</w:t>
+      </w:r>
+    </w:p>
+    <w:p>
+      <w:pPr>
+        <w:pStyle w:val="BodyText"/>
+      </w:pPr>
+      <w:r>
+        <w:t xml:space="preserve">Poniżej przedstawiono trzy modelowe, czterofazowe protokoły postępowania fizjoterapeutycznego, odpowiadające trzem najczęściej występującym w badanej grupie lokalizacjom i rodzajom urazu: skręceniu inwersyjnemu stawu skokowego (33,9% wskazań), urazowi skrętnemu stawu kolanowego (30,4% wskazań) oraz ostremu urazowi mięśni kulszowo-goleniowych (kluczowy komponent 21,4% urazów mięśni uda). Każdy z protokołów integruje zasady wczesnego postępowania przeciwzapalnego według schematu </w:t>
+      </w:r>
+      <w:r>
+        <w:rPr>
+          <w:iCs/>
+          <w:i/>
+        </w:rPr>
+        <w:t xml:space="preserve">PEACE &amp; LOVE</w:t>
+      </w:r>
+      <w:r>
+        <w:t xml:space="preserve"> [RR], koncepcję rehabilitacji opartej na kryteriach (</w:t>
+      </w:r>
+      <w:r>
+        <w:rPr>
+          <w:iCs/>
+          <w:i/>
+        </w:rPr>
+        <w:t xml:space="preserve">criteria-based rehabilitation</w:t>
+      </w:r>
+      <w:r>
+        <w:t xml:space="preserve">) [TT] oraz – w bezpośredniej odpowiedzi na deficyty wykazane w badaniu własnym – obiektywne narzędzia oceny gotowości funkcjonalnej i psychologicznej do powrotu do rywalizacji [UU, VV, WW].</w:t>
+      </w:r>
+    </w:p>
+    <w:p>
+      <w:pPr>
+        <w:pStyle w:val="Heading2"/>
+      </w:pPr>
+      <w:r>
+        <w:t xml:space="preserve">7.1. Protokół postępowania po ostrym skręceniu inwersyjnym stawu skokowego</w:t>
+      </w:r>
+    </w:p>
+    <w:p>
+      <w:pPr>
+        <w:pStyle w:val="FirstParagraph"/>
+      </w:pPr>
+      <w:r>
+        <w:t xml:space="preserve">Skręcenie inwersyjne stawu skokowego, obejmujące uszkodzenie kompleksu więzadeł bocznych (ATFL, CFL), stanowiło najczęściej zgłaszaną lokalizację najpoważniejszego urazu w badanej grupie (33,9% wskazań), co pozostaje zgodne z danymi epidemiologicznymi raportowanymi w piłce nożnej na poziomie profesjonalnym [QQ]. Zaproponowany protokół kładzie nacisk na wczesną, funkcjonalną mobilizację stawu – w miejsce przedłużonego unieruchomienia – oraz na obiektywizację kryteriów powrotu do gry, adresując bezpośrednio stwierdzony w badaniu własnym deficyt testowania funkcjonalnego.</w:t>
+      </w:r>
+    </w:p>
+    <w:p>
+      <w:pPr>
+        <w:pStyle w:val="Heading3"/>
+      </w:pPr>
+      <w:r>
+        <w:t xml:space="preserve">Faza I. Ochrona tkanek i kontrola reakcji zapalnej (doba 0.–3./5.)</w:t>
+      </w:r>
+    </w:p>
+    <w:p>
+      <w:pPr>
+        <w:pStyle w:val="BodyText"/>
+      </w:pPr>
+      <w:r>
+        <w:t xml:space="preserve">Postępowanie wczesne opiera się na zasadach protokołu </w:t>
+      </w:r>
+      <w:r>
+        <w:rPr>
+          <w:iCs/>
+          <w:i/>
+        </w:rPr>
+        <w:t xml:space="preserve">PEACE &amp; LOVE</w:t>
+      </w:r>
+      <w:r>
+        <w:t xml:space="preserve"> [RR]: ochronie stawu przed dalszym obciążaniem prowokującym ból (odciążenie, stabilizator półsztywny, kule łokciowe wyłącznie przy chodzie utykającym), uniesieniu kończyny, unikaniu nadużywania leków przeciwzapalnych i przedłużonej krioterapii mogącej zaburzać naturalny proces gojenia więzadła, kompresji (bandaż elastyczny, taping funkcjonalny) oraz edukacji zawodnika co do korzystnego rokowania i konieczności unikania przedłużonego unieruchomienia. Postępowanie czynne obejmuje izometryczne napięcia mięśni strzałkowych i piszczelowego przedniego w zakresie bezbolesnym, ćwiczenia czynnego zakresu ruchu (tzw. „alfabet stopy”) oraz naukę chodu bez kompensacji. Kryterium przejścia do fazy II: ból ≤3/10 w skali VAS w spoczynku, chód bez utykania, kontrolowany obrzęk oraz zakres zgięcia grzbietowego ≥75% wartości kończyny zdrowej.</w:t>
+      </w:r>
+    </w:p>
+    <w:p>
+      <w:pPr>
+        <w:pStyle w:val="Heading3"/>
+      </w:pPr>
+      <w:r>
+        <w:t xml:space="preserve">Faza II. Odbudowa strukturalna i funkcjonalna (tydzień 1.–4.)</w:t>
+      </w:r>
+    </w:p>
+    <w:p>
+      <w:pPr>
+        <w:pStyle w:val="BodyText"/>
+      </w:pPr>
+      <w:r>
+        <w:t xml:space="preserve">Faza ta realizuje komponent </w:t>
+      </w:r>
+      <w:r>
+        <w:rPr>
+          <w:iCs/>
+          <w:i/>
+        </w:rPr>
+        <w:t xml:space="preserve">LOVE</w:t>
+      </w:r>
+      <w:r>
+        <w:t xml:space="preserve"> protokołu – obciążanie (</w:t>
+      </w:r>
+      <w:r>
+        <w:rPr>
+          <w:iCs/>
+          <w:i/>
+        </w:rPr>
+        <w:t xml:space="preserve">Load</w:t>
+      </w:r>
+      <w:r>
+        <w:t xml:space="preserve">), optymizm, wsparcie waskularyzacji poprzez ruch oraz ćwiczenia (</w:t>
+      </w:r>
+      <w:r>
+        <w:rPr>
+          <w:iCs/>
+          <w:i/>
+        </w:rPr>
+        <w:t xml:space="preserve">Exercise</w:t>
+      </w:r>
+      <w:r>
+        <w:t xml:space="preserve">) [RR]. Priorytetem jest przywrócenie pełnego, symetrycznego zakresu zgięcia grzbietowego (test </w:t>
+      </w:r>
+      <w:r>
+        <w:rPr>
+          <w:iCs/>
+          <w:i/>
+        </w:rPr>
+        <w:t xml:space="preserve">weight-bearing lunge</w:t>
+      </w:r>
+      <w:r>
+        <w:t xml:space="preserve">), progresywne wzmacnianie koncentryczne i ekscentryczne mięśni strzałkowych oraz zginaczy grzbietowych z użyciem taśm oporowych, a także reedukacja nerwowo-mięśniowa i propriocepcja – od stania obunóż z zamkniętymi oczami, przez chwiejne podłoże, po stanie jednonóż na niestabilnym podłożu. Wprowadza się ćwiczenia w zamkniętych łańcuchach kinematycznych (przysiady częściowe, wykroki, zejścia ze stopnia) oraz, w przypadku ograniczeń kapsularnych, terapię manualną ukierunkowaną na mobilizację stawu skokowo-goleniowego i podskokowego. Kryterium progresji do fazy III: pełny bezbolesny zakres ruchu, utrzymanie pozycji jednonóż ≥30 s z oczami otwartymi oraz bezbolesny, symetryczny chód i trucht liniowy.</w:t>
+      </w:r>
+    </w:p>
+    <w:p>
+      <w:pPr>
+        <w:pStyle w:val="Heading3"/>
+      </w:pPr>
+      <w:r>
+        <w:t xml:space="preserve">Faza III. Przygotowanie specyficzne dla piłki nożnej – Return to Train (tydzień 3.–6.)</w:t>
+      </w:r>
+    </w:p>
+    <w:p>
+      <w:pPr>
+        <w:pStyle w:val="BodyText"/>
+      </w:pPr>
+      <w:r>
+        <w:t xml:space="preserve">Trening ukierunkowany na powrót do zajęć zespołowych obejmuje progresywną plyometrię (odbicia obunóż → jednonóż, wieloskoki boczne, zeskoki z wysokości z kontrolą lądowania), ćwiczenia koordynacyjne z drabinką oraz progresję zmian kierunku biegu (</w:t>
+      </w:r>
+      <w:r>
+        <w:rPr>
+          <w:iCs/>
+          <w:i/>
+        </w:rPr>
+        <w:t xml:space="preserve">cutting</w:t>
+      </w:r>
+      <w:r>
+        <w:t xml:space="preserve">) – od zaplanowanych do reaktywnych, bodźcowanych wzrokowo lub słuchowo, co bezpośrednio trenuje tzw. boiskowy spryt i antycypację, ograniczając ekspozycję na sytuacje wysokiego ryzyka. Włącza się sprint liniowy o progresywnej intensywności, dalszą pracę siłową mięśni strzałkowych i trójgłowego łydki w pełnym zakresie ruchu oraz stopniowe włączanie do treningu z piłką, a następnie do kontaktu z przeciwnikiem. Kryterium progresji do fazy IV: pełne obciążenie treningowe bez bólu i bez nawrotu obrzęku po jednostce treningowej.</w:t>
+      </w:r>
+    </w:p>
+    <w:p>
+      <w:pPr>
+        <w:pStyle w:val="Heading3"/>
+      </w:pPr>
+      <w:r>
+        <w:t xml:space="preserve">Faza IV. Obiektywne kryteria powrotu do pełnej rywalizacji (Criteria-Based Return to Play)</w:t>
+      </w:r>
+    </w:p>
+    <w:p>
+      <w:pPr>
+        <w:pStyle w:val="BodyText"/>
+      </w:pPr>
+      <w:r>
+        <w:t xml:space="preserve">Decyzję o powrocie do pełnej rywalizacji warunkuje łączne spełnienie następujących kryteriów, nie zaś wyłącznie upływ czasu od urazu: (1) wskaźnik symetrii kończyn (</w:t>
+      </w:r>
+      <w:r>
+        <w:rPr>
+          <w:iCs/>
+          <w:i/>
+        </w:rPr>
+        <w:t xml:space="preserve">Limb Symmetry Index</w:t>
+      </w:r>
+      <w:r>
+        <w:t xml:space="preserve">, LSI) ≥90% w baterii testów skoku jednonóż (</w:t>
+      </w:r>
+      <w:r>
+        <w:rPr>
+          <w:iCs/>
+          <w:i/>
+        </w:rPr>
+        <w:t xml:space="preserve">single hop for distance</w:t>
+      </w:r>
+      <w:r>
+        <w:t xml:space="preserve">, </w:t>
+      </w:r>
+      <w:r>
+        <w:rPr>
+          <w:iCs/>
+          <w:i/>
+        </w:rPr>
+        <w:t xml:space="preserve">triple hop</w:t>
+      </w:r>
+      <w:r>
+        <w:t xml:space="preserve">, </w:t>
+      </w:r>
+      <w:r>
+        <w:rPr>
+          <w:iCs/>
+          <w:i/>
+        </w:rPr>
+        <w:t xml:space="preserve">crossover hop</w:t>
+      </w:r>
+      <w:r>
+        <w:t xml:space="preserve">, </w:t>
+      </w:r>
+      <w:r>
+        <w:rPr>
+          <w:iCs/>
+          <w:i/>
+        </w:rPr>
+        <w:t xml:space="preserve">6-metre timed hop</w:t>
+      </w:r>
+      <w:r>
+        <w:t xml:space="preserve">); (2) wynik testu </w:t>
+      </w:r>
+      <w:r>
+        <w:rPr>
+          <w:iCs/>
+          <w:i/>
+        </w:rPr>
+        <w:t xml:space="preserve">Y-Balance</w:t>
+      </w:r>
+      <w:r>
+        <w:t xml:space="preserve"> z asymetrią zasięgu przedniego &lt;4 cm między kończynami [XX]; (3) siła mięśni odwracaczy/nawracaczy stopy oceniona dynamometrycznie, z LSI ≥90%; (4) czas sprintu oraz wynik testu zmiany kierunku (np. </w:t>
+      </w:r>
+      <w:r>
+        <w:rPr>
+          <w:iCs/>
+          <w:i/>
+        </w:rPr>
+        <w:t xml:space="preserve">505 Agility Test</w:t>
+      </w:r>
+      <w:r>
+        <w:t xml:space="preserve">) w granicach 10% wartości sprzed urazu; (5) wynik Skali Kinezjofobii Tampa (TSK) poniżej progu wskazującego na klinicznie istotny lęk przed ruchem [WW]. Zgodnie z modelem decyzyjnym </w:t>
+      </w:r>
+      <w:r>
+        <w:rPr>
+          <w:iCs/>
+          <w:i/>
+        </w:rPr>
+        <w:t xml:space="preserve">return to play</w:t>
+      </w:r>
+      <w:r>
+        <w:t xml:space="preserve"> [AD] oraz konsensusem z Bern [AC] ostateczna decyzja powinna mieć charakter zespołowy – z udziałem lekarza, fizjoterapeuty i trenera przygotowania motorycznego – co stanowi bezpośrednie przeciwdziałanie modelowi ujawnionemu w badaniu własnym, w którym w 58,9% przypadków decyzję tę podejmował samodzielnie sam zawodnik.</w:t>
+      </w:r>
+    </w:p>
+    <w:p>
+      <w:pPr>
+        <w:pStyle w:val="Heading2"/>
+      </w:pPr>
+      <w:r>
+        <w:t xml:space="preserve">7.2. Protokół postępowania w urazach skrętnych stawu kolanowego / rekonstrukcji ACL</w:t>
+      </w:r>
+    </w:p>
+    <w:p>
+      <w:pPr>
+        <w:pStyle w:val="FirstParagraph"/>
+      </w:pPr>
+      <w:r>
+        <w:t xml:space="preserve">Staw kolanowy stanowił drugą pod względem częstości lokalizację najpoważniejszego urazu w badanej grupie (30,4% wskazań), a wśród zgłaszanych rodzajów uszkodzeń istotny udział miały naderwania/zerwania więzadeł (28,6% ogółu urazów), w tym struktury ACL i MCL wskazywane najczęściej w analizie opisów tekstowych. Ze względu na zróżnicowany charakter tych urazów – od izolowanego uszkodzenia więzadła pobocznego piszczelowego po rekonstrukcję więzadła krzyżowego przedniego wymagającą leczenia operacyjnego – zaproponowany protokół ma charakter ramowy, oparty na wieloośrodkowych wytycznych rehabilitacji pooperacyjnej ACL [TT], z zastrzeżeniem indywidualizacji czasu trwania poszczególnych faz względem rodzaju uszkodzenia, zastosowanego przeszczepu oraz ewentualnej jednoczasowej rekonstrukcji łąkotki.</w:t>
+      </w:r>
+    </w:p>
+    <w:p>
+      <w:pPr>
+        <w:pStyle w:val="Heading3"/>
+      </w:pPr>
+      <w:r>
+        <w:t xml:space="preserve">Faza I. Ochrona stawu i kontrola wysięku (tydzień 0.–2.)</w:t>
+      </w:r>
+    </w:p>
+    <w:p>
+      <w:pPr>
+        <w:pStyle w:val="BodyText"/>
+      </w:pPr>
+      <w:r>
+        <w:t xml:space="preserve">Postępowanie wczesne obejmuje ochronę stawu (ortezowanie zależne od stopnia niestabilności więzadłowej), kontrolę wysięku metodami kompresji i uniesienia kończyny, przy ograniczonym stosowaniu przedłużonej krioterapii [RR], a przede wszystkim wczesne, kontrolowane odzyskiwanie zakresu ruchu, ze szczególnym naciskiem na pełny, symetryczny wyprost bierny kolana – jeden z najsilniejszych predyktorów niekorzystnego wyniku funkcjonalnego w obserwacji odległej. Kluczowym elementem jest wczesna reedukacja mięśnia czworogłowego uda (napięcia izometryczne, uniesienia prostej kończyny bez deficytu wyprostu, elektrostymulacja nerwowo-mięśniowa w przypadku istotnego zahamowania z mechanizmu artrogennego) oraz normalizacja wzorca chodu. Kryterium progresji: pełny, symetryczny wyprost bierny, zgięcie czynne ≥90–100°, minimalny wysięk oraz kontrola mięśnia czworogłowego bez opadania kończyny podczas uniesienia prostej nogi.</w:t>
+      </w:r>
+    </w:p>
+    <w:p>
+      <w:pPr>
+        <w:pStyle w:val="Heading3"/>
+      </w:pPr>
+      <w:r>
+        <w:t xml:space="preserve">Faza II. Odbudowa strukturalna i funkcjonalna (miesiąc 1.–3.)</w:t>
+      </w:r>
+    </w:p>
+    <w:p>
+      <w:pPr>
+        <w:pStyle w:val="BodyText"/>
+      </w:pPr>
+      <w:r>
+        <w:t xml:space="preserve">Trening siłowy prowadzony jest progresywnie w zamkniętych łańcuchach kinematycznych (przysiady, prasa nożna, wejścia na stopień), z włączeniem ćwiczeń w łańcuchu otwartym dla mięśnia czworogłowego zgodnie z ograniczeniami właściwymi dla rodzaju przeszczepu i fazy gojenia tkanki [TT]. Równolegle prowadzi się trening propriocepcji i kontroli nerwowo-mięśniowej (stanie jednonóż z progresją zaburzeń równowagi, ćwiczenia na platformie niestabilnej), trening wytrzymałościowy o niskim obciążeniu stawu (rower stacjonarny, trening w wodzie) oraz – wobec wykazanej w badaniu własnym istotnej korelacji liczby urazów i etapowości powrotu z poziomem kinezjofobii (odpowiednio p = 0,003 i p = 0,014) – ustrukturyzowaną edukację zawodnika i stopniową ekspozycję na obciążenia wywołujące lęk. Powrót do biegania liniowego następuje zwykle po osiągnięciu LSI siły mięśnia czworogłowego ≥80% oraz pełnego, bezbolesnego zakresu ruchu. Kryterium progresji do fazy III: LSI siły ≥80%, bezbolesny przysiad jednonóż, bezbolesny trucht liniowy.</w:t>
+      </w:r>
+    </w:p>
+    <w:p>
+      <w:pPr>
+        <w:pStyle w:val="Heading3"/>
+      </w:pPr>
+      <w:r>
+        <w:t xml:space="preserve">Faza III. Przygotowanie specyficzne dla piłki nożnej – Return to Train (miesiąc 4.–7.)</w:t>
+      </w:r>
+    </w:p>
+    <w:p>
+      <w:pPr>
+        <w:pStyle w:val="BodyText"/>
+      </w:pPr>
+      <w:r>
+        <w:t xml:space="preserve">Trening obejmuje progresywną plyometrię z priorytetem kontroli mechaniki lądowania w płaszczyźnie czołowej (redukcja koślawienia dynamicznego kolana), ćwiczenia deceleracji i zmiany kierunku – od zaplanowanych do reaktywnych, z obciążeniem poznawczym (podwójne zadanie) – ekspozycję na prędkości maksymalne biegu sprinterskiego oraz stopniową reintegrację z treningiem zespołowym, początkowo bez kontaktu, następnie z kontaktem. Trening siłowy kontynuowany jest z celem osiągnięcia LSI ≥90% zarówno dla mięśnia czworogłowego, jak i grupy kulszowo-goleniowej. Na tym etapie inicjuje się formalną ocenę gotowości psychologicznej za pomocą skali </w:t>
+      </w:r>
+      <w:r>
+        <w:rPr>
+          <w:iCs/>
+          <w:i/>
+        </w:rPr>
+        <w:t xml:space="preserve">ACL-RSI</w:t>
+      </w:r>
+      <w:r>
+        <w:t xml:space="preserve"> [VV]. Kryterium progresji do fazy IV: LSI siły i skoku ≥90%, brak bólu i wysięku po treningu o wysokiej intensywności.</w:t>
+      </w:r>
+    </w:p>
+    <w:p>
+      <w:pPr>
+        <w:pStyle w:val="Heading3"/>
+      </w:pPr>
+      <w:r>
+        <w:t xml:space="preserve">Faza IV. Obiektywne kryteria powrotu do pełnej rywalizacji</w:t>
+      </w:r>
+    </w:p>
+    <w:p>
+      <w:pPr>
+        <w:pStyle w:val="BodyText"/>
+      </w:pPr>
+      <w:r>
+        <w:t xml:space="preserve">Powrót do pełnej rywalizacji po rekonstrukcji ACL nie powinien następować wcześniej niż 9 miesięcy od zabiegu i wyłącznie po łącznym spełnieniu kryteriów: (1) LSI siły mięśnia czworogłowego i grupy kulszowo-goleniowej ≥90%, oceniony dynamometrycznie; (2) LSI ≥90–95% w baterii testów skoku jednonóż [UU]; (3) symetryczny wynik testu </w:t>
+      </w:r>
+      <w:r>
+        <w:rPr>
+          <w:iCs/>
+          <w:i/>
+        </w:rPr>
+        <w:t xml:space="preserve">Y-Balance</w:t>
+      </w:r>
+      <w:r>
+        <w:t xml:space="preserve"> [XX]; (4) wynik skali </w:t>
+      </w:r>
+      <w:r>
+        <w:rPr>
+          <w:iCs/>
+          <w:i/>
+        </w:rPr>
+        <w:t xml:space="preserve">ACL-RSI</w:t>
+      </w:r>
+      <w:r>
+        <w:t xml:space="preserve"> powyżej progu wskazującego na niskie ryzyko ponownego urazu [VV]; (5) wynik Skali Kinezjofobii Tampa poniżej progu istotnego klinicznie [WW]. Wykazano, że spełnienie powyższych kryteriów przed powrotem do sportu zmniejsza ryzyko ponownego urazu więzadła nawet o 84%, a każdy dodatkowy miesiąc opóźnienia powrotu między 6. a 9. miesiącem od zabiegu redukuje to ryzyko o kolejne 51% [UU], co stanowi bezpośredni argument przeciwko modelowi czasowemu i samodzielnemu podejmowaniu decyzji o powrocie, ujawnionemu w badaniu własnym u 58,9% respondentów. Decyzja końcowa powinna mieć charakter interdyscyplinarny, zgodnie z modelem decyzyjnym RTP [AD] oraz konsensusem berneńskim [AC].</w:t>
+      </w:r>
+    </w:p>
+    <w:p>
+      <w:pPr>
+        <w:pStyle w:val="Heading2"/>
+      </w:pPr>
+      <w:r>
+        <w:t xml:space="preserve">7.3. Protokół postępowania w ostrym naciągnięciu/naderwaniu mięśni kulszowo-goleniowych (hamstring strain injury)</w:t>
+      </w:r>
+    </w:p>
+    <w:p>
+      <w:pPr>
+        <w:pStyle w:val="FirstParagraph"/>
+      </w:pPr>
+      <w:r>
+        <w:t xml:space="preserve">Naderwania/zerwania mięśnia stanowiły 25,0% wszystkich najpoważniejszych urazów w badanej grupie, a mięśnie uda – z dominującym udziałem grupy kulszowo-goleniowej – były obszarem anatomicznym wskazywanym w 21,4% przypadków. Uraz ten charakteryzuje się jednym z najwyższych w piłce nożnej wskaźników nawrotowości, sięgającym nawet 30% w pierwszym roku po powrocie do gry [YY], co pozostaje w bezpośrednim związku z wykazanym w badaniu własnym marginalnym wykorzystaniem treningu ekscentrycznego/izometrycznego, stosowanego jedynie przez 26,9% badanych mimo jego udokumentowanej skuteczności prewencyjnej [ZZ]. Zaproponowany protokół stawia pracę ekscentryczną w centrum procesu usprawniania, adresując bezpośrednio ten zidentyfikowany deficyt.</w:t>
+      </w:r>
+    </w:p>
+    <w:p>
+      <w:pPr>
+        <w:pStyle w:val="Heading3"/>
+      </w:pPr>
+      <w:r>
+        <w:t xml:space="preserve">Faza I. Ochrona tkanki i kontrola bólu (doba 0.–5.)</w:t>
+      </w:r>
+    </w:p>
+    <w:p>
+      <w:pPr>
+        <w:pStyle w:val="BodyText"/>
+      </w:pPr>
+      <w:r>
+        <w:t xml:space="preserve">Postępowanie wczesne obejmuje chód z częściowym odciążeniem w zakresie bezbolesnym, kompresję okolicy urazu, unikanie agresywnego rozciągania statycznego mogącego pogłębić uszkodzenie włókien – zwłaszcza przy zajęciu wolnego ścięgna proksymalnego, lokalizacji istotnie wydłużającej czas powrotu do sportu [AB] – oraz wprowadzenie łagodnych, bezbolesnych napięć izometrycznych mięśni kulszowo-goleniowych w pozycjach niskiego obciążenia. Zgodnie z zasadami </w:t>
+      </w:r>
+      <w:r>
+        <w:rPr>
+          <w:iCs/>
+          <w:i/>
+        </w:rPr>
+        <w:t xml:space="preserve">PEACE &amp; LOVE</w:t>
+      </w:r>
+      <w:r>
+        <w:t xml:space="preserve"> ogranicza się rutynowe stosowanie niesteroidowych leków przeciwzapalnych w pierwszych dobach, które mogą zaburzać proces regeneracji tkanki mięśniowej [RR]. Kryterium progresji do fazy II: bezbolesny chód, bezbolesne napięcie izometryczne o niskiej intensywności, brak progresji krwiaka/obrzęku.</w:t>
+      </w:r>
+    </w:p>
+    <w:p>
+      <w:pPr>
+        <w:pStyle w:val="Heading3"/>
+      </w:pPr>
+      <w:r>
+        <w:t xml:space="preserve">Faza II. Odbudowa strukturalna i funkcjonalna – progresja obciążenia ekscentrycznego (tydzień 1.–3.)</w:t>
+      </w:r>
+    </w:p>
+    <w:p>
+      <w:pPr>
+        <w:pStyle w:val="BodyText"/>
+      </w:pPr>
+      <w:r>
+        <w:t xml:space="preserve">Faza ta stanowi kluczowy element protokołu, bezpośrednio odpowiadający na stwierdzony w badaniu własnym deficyt pracy ekscentrycznej. Obciążenie tkanki prowadzone jest progresywnie od skurczów izometrycznych, przez koncentryczne, aż po kontrolowaną pracę ekscentryczną, zgodnie z protokołem L (</w:t>
+      </w:r>
+      <w:r>
+        <w:rPr>
+          <w:iCs/>
+          <w:i/>
+        </w:rPr>
+        <w:t xml:space="preserve">L-protocol</w:t>
+      </w:r>
+      <w:r>
+        <w:t xml:space="preserve">) Asklinga, obejmującym trzy ćwiczenia wydłużające (</w:t>
+      </w:r>
+      <w:r>
+        <w:rPr>
+          <w:iCs/>
+          <w:i/>
+        </w:rPr>
+        <w:t xml:space="preserve">extender</w:t>
+      </w:r>
+      <w:r>
+        <w:t xml:space="preserve">, </w:t>
+      </w:r>
+      <w:r>
+        <w:rPr>
+          <w:iCs/>
+          <w:i/>
+        </w:rPr>
+        <w:t xml:space="preserve">diver</w:t>
+      </w:r>
+      <w:r>
+        <w:t xml:space="preserve">, </w:t>
+      </w:r>
+      <w:r>
+        <w:rPr>
+          <w:iCs/>
+          <w:i/>
+        </w:rPr>
+        <w:t xml:space="preserve">glider</w:t>
+      </w:r>
+      <w:r>
+        <w:t xml:space="preserve">), który w badaniach porównawczych istotnie skrócił czas powrotu do pełnego treningu względem protokołu konwencjonalnego [AB]. Równolegle prowadzi się trening stabilizacji tułowia i miednicy (kontrola przechylenia miednicy, praca mięśni pośladkowych) z uwagi na ścisły funkcjonalny związek między kontrolą lędźwiowo-miedniczną a obciążeniem mięśni kulszowo-goleniowych [YY]. Bieganie w formie truchtu liniowego wprowadza się po uzyskaniu bezbolesnego, maksymalnego skurczu izometrycznego. Kryterium progresji do fazy III: bezbolesny trucht liniowy, bezbolesny czynny test rozciągliwości (aktywne uniesienie prostej nogi) w zakresie funkcjonalnym.</w:t>
+      </w:r>
+    </w:p>
+    <w:p>
+      <w:pPr>
+        <w:pStyle w:val="Heading3"/>
+      </w:pPr>
+      <w:r>
+        <w:t xml:space="preserve">Faza III. Przygotowanie specyficzne dla piłki nożnej – Return to Train (tydzień 3.–6.)</w:t>
+      </w:r>
+    </w:p>
+    <w:p>
+      <w:pPr>
+        <w:pStyle w:val="BodyText"/>
+      </w:pPr>
+      <w:r>
+        <w:t xml:space="preserve">Z uwagi na fakt, iż uraz mięśni kulszowo-goleniowych powstaje najczęściej w fazie zamachu zakrocznego biegu sprinterskiego przy prędkościach bliskich maksymalnym, kluczowym elementem tej fazy jest kontrolowana, progresywna ekspozycja na sprint o rosnącej intensywności, aż do osiągnięcia prędkości maksymalnej w warunkach kontrolowanych. Program treningu ekscentrycznego kontynuowany jest z włączeniem ćwiczenia nordyckiego (</w:t>
+      </w:r>
+      <w:r>
+        <w:rPr>
+          <w:iCs/>
+          <w:i/>
+        </w:rPr>
+        <w:t xml:space="preserve">Nordic hamstring exercise</w:t>
+      </w:r>
+      <w:r>
+        <w:t xml:space="preserve">), które w randomizowanym badaniu klastrowym z udziałem piłkarzy zredukowało liczbę nowych urazów mięśni kulszowo-goleniowych o 60%, a urazów nawrotowych – o 85% [ZZ]. Trening uzupełniają ćwiczenia plyometryczne, deceleracja, zmiany kierunku biegu oraz zadania zwinnościowe z bodźcem nieprzewidywalnym, integrowane stopniowo z pracą techniczną z piłką. Kryterium progresji do fazy IV: pełny, niezależny od lęku sprint maksymalny bez bólu oraz siła ekscentryczna zbliżająca się do LSI ≥90%.</w:t>
+      </w:r>
+    </w:p>
+    <w:p>
+      <w:pPr>
+        <w:pStyle w:val="Heading3"/>
+      </w:pPr>
+      <w:r>
+        <w:t xml:space="preserve">Faza IV. Obiektywne kryteria powrotu do pełnej rywalizacji</w:t>
+      </w:r>
+    </w:p>
+    <w:p>
+      <w:pPr>
+        <w:pStyle w:val="BodyText"/>
+      </w:pPr>
+      <w:r>
+        <w:t xml:space="preserve">Decyzję o powrocie do pełnej rywalizacji warunkuje: (1) siła ekscentryczna mięśni kulszowo-goleniowych z LSI ≥90–95%, oceniona dynamometrycznie – uznawana za najsilniejszy pojedynczy predyktor ryzyka nawrotu tego urazu [YY]; (2) wynik baterii testów skoku jednonóż jako uzupełniające potwierdzenie symetrii funkcjonalnej kończyn [UU]; (3) osiągnięcie prędkości sprintu maksymalnego odpowiadającej wartościom sprzed urazu; (4) niski poziom lęku przed ponownym urazem w Skali Kinezjofobii Tampa [WW], co ma szczególne znaczenie kliniczne w kontekście wykazanej w badaniu własnym istotnej korelacji między liczbą przebytych urazów a nasileniem kinezjofobii (rho = 0,385; p = 0,003). Po powrocie do rywalizacji rekomenduje się utrzymanie cyklicznego programu treningu ekscentrycznego jako elementu profilaktyki wtórnej [ZZ], z uwzględnieniem wykazanej w niniejszym badaniu (hipoteza H5) zależności, zgodnie z którą rzetelna edukacja zawodnika istotnie zwiększa trwałe wdrożenie tej formy treningu.</w:t>
+      </w:r>
+    </w:p>
+    <w:p>
+      <w:pPr>
+        <w:pStyle w:val="Heading1"/>
+      </w:pPr>
+      <w:r>
+        <w:t xml:space="preserve">Rozdział VIII. Dyskusja i wnioski</w:t>
+      </w:r>
+    </w:p>
+    <w:p>
+      <w:pPr>
+        <w:pStyle w:val="Heading2"/>
+      </w:pPr>
+      <w:r>
+        <w:t xml:space="preserve">8.1. Dyskusja wyników</w:t>
+      </w:r>
+    </w:p>
+    <w:p>
+      <w:pPr>
+        <w:pStyle w:val="FirstParagraph"/>
+      </w:pPr>
+      <w:r>
+        <w:t xml:space="preserve">Rozkład urazów kończyn dolnych stwierdzony w badaniu własnym pozostaje spójny z danymi epidemiologicznymi raportowanymi w piłce nożnej na poziomie profesjonalnym, mimo odmiennej metodologii gromadzenia danych (retrospektywna ankieta samoopisowa w populacji amatorskiej/półprofesjonalnej wobec prospektywnego nadzoru medycznego w badaniach klubowych). Dominacja urazów stawu skokowego (33,9%) i kolanowego (30,4%) odpowiada wynikom UEFA Injury Study, w którym uraz mięśnia kulszowo-goleniowego i skręcenia stawu skokowego pozostają jednymi z najczęściej rejestrowanych jednostek urazowych w piłce nożnej na poziomie elitarnym [QQ]. Równy udział mechanizmu kontaktowego i bezkontaktowego w powstawaniu urazów (odpowiednio po 50,0%) potwierdza dwutorowy charakter etiologii kontuzji piłkarskich – zarówno bezpośredni kontakt z przeciwnikiem, jak i czynniki biomechaniczne związane z gwałtownymi zmianami kierunku biegu i lądowaniami, opisane szczegółowo w Rozdziale II niniejszej pracy. Zbieżność ta, mimo istotnych różnic metodologicznych między badaniami, wskazuje na uniwersalny, niezależny od poziomu sportowego charakter podstawowych mechanizmów urazowości w tej dyscyplinie.</w:t>
+      </w:r>
+    </w:p>
+    <w:p>
+      <w:pPr>
+        <w:pStyle w:val="BodyText"/>
+      </w:pPr>
+      <w:r>
+        <w:t xml:space="preserve">Wykazany związek między krótszym stażem zawodniczym a istotnie częstszym występowaniem urazu (Me = 10 lat w grupie z urazem wobec Me = 14 lat w grupie bez urazu; p = 0,039) można wyjaśnić na kilku uzupełniających się płaszczyznach. Po pierwsze, dłuższy staż treningowy wiąże się z postępującą adaptacją strukturalną tkanek biernych – zwiększoną sztywnością i wytrzymałością mechaniczną ścięgien i więzadeł na obciążenia powtarzalne – oraz z doskonaleniem wzorców nerwowo-mięśniowych ograniczających niekorzystne obciążenia stawów. Po drugie, zawodnicy z dłuższym doświadczeniem startowym dysponują lepiej rozwiniętą świadomością ciała oraz tzw. „boiskowym sprytem” – zdolnością antycypacji sytuacji kontaktowych i wyboru bezpieczniejszych wariantów technicznych, co ogranicza ekspozycję na sytuacje wysokiego ryzyka. Nie można również wykluczyć efektu przetrwania (survivorship bias), charakterystycznego dla badań przekrojowych: zawodnicy szczególnie podatni na kontuzje mogli zakończyć aktywność sportową przed osiągnięciem dłuższego stażu, co selekcjonuje w grupie „doświadczonej” zawodników relatywnie bardziej odpornych na urazy.</w:t>
+      </w:r>
+    </w:p>
+    <w:p>
+      <w:pPr>
+        <w:pStyle w:val="BodyText"/>
+      </w:pPr>
+      <w:r>
+        <w:t xml:space="preserve">Brak istotnej statystycznie zależności między obecnością zorganizowanej profilaktyki klubowej a liczbą doznanych urazów (p = 0,913) stanowi pozorny paradoks w świetle silnych dowodów naukowych na skuteczność ustrukturyzowanych programów prewencyjnych typu FIFA 11+. Wyjaśnienia tego zjawiska należy szukać przede wszystkim w ograniczeniach metodologicznych właściwych badaniom przekrojowym – w zjawisku odwrotnej przyczynowości, w którym zawodnicy po przebytym poważnym urazie mogą wtórnie intensyfikować działania profilaktyczne, co zaciera w danych przekrojowych rzeczywisty, ochronny kierunek zależności. Równie istotna wydaje się powierzchowność wielu klubowych „programów profilaktycznych” zadeklarowanych przez respondentów: w badanej grupie jedynie 29,9% zawodników uczestniczyło w ustrukturyzowanej profilaktyce o charakterze zbliżonym do protokołów o udokumentowanej skuteczności, podczas gdy 33,8% ograniczało się do ogólnorozwojowej rozgrzewki przedtreningowej, pozbawionej kluczowych elementów neuromotorycznych (praca ekscentryczna, trening równowagi, plyometria). Skuteczność profilaktyki zależy nie od samego faktu jej deklarowanego istnienia, lecz od wierności jej wdrożenia (compliance) oraz zgodności z komponentami o potwierdzonej biomechanicznie skuteczności – aspektu, którego badanie o charakterze przekrojowym nie było w stanie zoperacjonalizować.</w:t>
+      </w:r>
+    </w:p>
+    <w:p>
+      <w:pPr>
+        <w:pStyle w:val="BodyText"/>
+      </w:pPr>
+      <w:r>
+        <w:t xml:space="preserve">Najbardziej niepokojącym wynikiem badania własnego pozostaje ujawniona luka w procedurze powrotu do gry: aż 76,8% badanych nie zostało poddanych żadnym obiektywnym testom funkcjonalnym przed powrotem do pełnej aktywności, a w 58,9% przypadków decyzję o powrocie podejmował samodzielnie sam zawodnik, z pominięciem personelu medycznego. Wyniki te pozostają w jaskrawej sprzeczności z aktualnym stanem wiedzy, zgodnie z którym stosowanie modelu opartego na obiektywnych kryteriach (</w:t>
+      </w:r>
+      <w:r>
+        <w:rPr>
+          <w:iCs/>
+          <w:i/>
+        </w:rPr>
+        <w:t xml:space="preserve">criteria-based RTP</w:t>
+      </w:r>
+      <w:r>
+        <w:t xml:space="preserve">) redukuje ryzyko ponownego urazu nawet o 84% [UU], a decyzja o powrocie powinna mieć charakter zespołowy, uwzględniający ocenę stanu zdrowia, ryzyka uczestnictwa oraz czynników modyfikujących [AD, AC]. Zjawisko to prawdopodobnie odzwierciedla nie tyle brak świadomości zawodników, ile strukturalne ograniczenia dostępu do infrastruktury medycyny sportowej na poziomie amatorskim i półprofesjonalnym, dominującym w badanej próbie (94,9%). Szczególnie istotnym uzupełnieniem tego obrazu jest wymiar psychologiczny: wykazana istotna korelacja między etapowością powrotu a nasileniem kinezjofobii (p = 0,014) oraz między liczbą przebytych urazów a poziomem lęku (rho = 0,385; p = 0,003) wskazuje, że aspekt psychologiczny procesu RTP pozostaje w praktyce klinicznej systematycznie pomijany, mimo że jego przesiewowa ocena za pomocą prostych, tanich narzędzi (Skala Kinezjofobii Tampa, </w:t>
+      </w:r>
+      <w:r>
+        <w:rPr>
+          <w:iCs/>
+          <w:i/>
+        </w:rPr>
+        <w:t xml:space="preserve">ACL-RSI</w:t>
+      </w:r>
+      <w:r>
+        <w:t xml:space="preserve">) mogłaby istotnie poprawić bezpieczeństwo powrotu do sportu bez istotnych nakładów organizacyjnych.</w:t>
+      </w:r>
+    </w:p>
+    <w:p>
+      <w:pPr>
+        <w:pStyle w:val="BodyText"/>
+      </w:pPr>
+      <w:r>
+        <w:t xml:space="preserve">Kluczowym, praktycznie użytecznym wynikiem niniejszego badania jest wykazany związek między samooceną wiedzy zawodnika na temat prewencji urazów a rzeczywistym wdrożeniem treningu ekscentrycznego/izometrycznego – wzrost odsetka stosujących tę formę ćwiczeń z 6,9% w grupie o niewystarczającej wiedzy do 52,4% w grupie o wiedzy w pełni wystarczającej (p = 0,002). Wynik ten koresponduje z modelem wiedza–postawa–zachowanie (</w:t>
+      </w:r>
+      <w:r>
+        <w:rPr>
+          <w:iCs/>
+          <w:i/>
+        </w:rPr>
+        <w:t xml:space="preserve">knowledge-attitude-practice</w:t>
+      </w:r>
+      <w:r>
+        <w:t xml:space="preserve">), zgodnie z którym rzetelna edukacja stanowi warunek konieczny, choć niewystarczający, trwałej zmiany zachowań zdrowotnych. W kontekście silnych dowodów na skuteczność treningu ekscentrycznego w prewencji urazów mięśni kulszowo-goleniowych – redukującego ryzyko nowych urazów o 60%, a nawrotowych aż o 85% [ZZ] – edukacja zawodników jawi się jako najtańsze i potencjalnie najskuteczniejsze narzędzie fizjoterapii prewencyjnej, możliwe do wdrożenia nawet w warunkach ograniczonych zasobów klubów amatorskich, w przeciwieństwie do kosztownej infrastruktury diagnostycznej wymaganej dla pełnej realizacji modelu </w:t>
+      </w:r>
+      <w:r>
+        <w:rPr>
+          <w:iCs/>
+          <w:i/>
+        </w:rPr>
+        <w:t xml:space="preserve">criteria-based RTP</w:t>
+      </w:r>
+      <w:r>
+        <w:t xml:space="preserve">.</w:t>
+      </w:r>
+    </w:p>
+    <w:p>
+      <w:pPr>
+        <w:pStyle w:val="BodyText"/>
+      </w:pPr>
+      <w:r>
+        <w:t xml:space="preserve">Interpretację przedstawionych wyników należy prowadzić z uwzględnieniem istotnych ograniczeń metodologicznych badania własnego: (1) przekrojowy charakter badania uniemożliwia wnioskowanie o kierunku związków przyczynowo-skutkowych; (2) próba badawcza (N = 78) miała charakter wygodny (</w:t>
+      </w:r>
+      <w:r>
+        <w:rPr>
+          <w:iCs/>
+          <w:i/>
+        </w:rPr>
+        <w:t xml:space="preserve">convenience sample</w:t>
+      </w:r>
+      <w:r>
+        <w:t xml:space="preserve">) i była zdominowana przez zawodników szczebla amatorskiego/półprofesjonalnego (94,9%), co ogranicza możliwość uogólnienia wyników na populację piłkarzy zawodowych; (3) dane o urazach sprzed maksymalnie 24 miesięcy obarczone są ryzykiem błędu pamięci (</w:t>
+      </w:r>
+      <w:r>
+        <w:rPr>
+          <w:iCs/>
+          <w:i/>
+        </w:rPr>
+        <w:t xml:space="preserve">recall bias</w:t>
+      </w:r>
+      <w:r>
+        <w:t xml:space="preserve">); (4) zastosowanie kwestionariusza samoopisowego niesie ryzyko obciążenia odpowiedzi społeczną aprobatą oraz obciążenia wspólną metodą pomiaru, co ma szczególne znaczenie przy interpretacji hipotezy H5.</w:t>
+      </w:r>
+    </w:p>
+    <w:p>
+      <w:pPr>
+        <w:pStyle w:val="Heading2"/>
+      </w:pPr>
+      <w:r>
+        <w:t xml:space="preserve">8.2. Wnioski końcowe</w:t>
+      </w:r>
+    </w:p>
+    <w:p>
+      <w:pPr>
+        <w:pStyle w:val="BodyText"/>
+      </w:pPr>
+      <w:r>
+        <w:rPr>
+          <w:bCs/>
+          <w:b/>
+        </w:rPr>
+        <w:t xml:space="preserve">1.</w:t>
+      </w:r>
+      <w:r>
+        <w:t xml:space="preserve"> Ekspozycja badanej grupy piłkarzy na urazy kończyny dolnej wykluczające z gry na minimum 7 dni pozostaje wysoka (71,8% w okresie 24 miesięcy), z dominującym udziałem stawu skokowego (33,9%) i kolanowego (30,4%) jako najczęstszych lokalizacji urazowych, co pozostaje zgodne z epidemiologią urazów piłkarskich raportowaną w piśmiennictwie międzynarodowym [QQ].</w:t>
+      </w:r>
+    </w:p>
+    <w:p>
+      <w:pPr>
+        <w:pStyle w:val="BodyText"/>
+      </w:pPr>
+      <w:r>
+        <w:rPr>
+          <w:bCs/>
+          <w:b/>
+        </w:rPr>
+        <w:t xml:space="preserve">2.</w:t>
+      </w:r>
+      <w:r>
+        <w:t xml:space="preserve"> Staż zawodniczy, a nie wiek czy poziom rozgrywkowy, stanowi istotny statystycznie czynnik różnicujący ryzyko wystąpienia urazu (p = 0,039), co częściowo potwierdza hipotezę H1 i wskazuje na kluczową rolę adaptacji tkankowej oraz doświadczenia motorycznego w prewencji kontuzji, szczególnie w pierwszych latach kariery zawodniczej.</w:t>
+      </w:r>
+    </w:p>
+    <w:p>
+      <w:pPr>
+        <w:pStyle w:val="BodyText"/>
+      </w:pPr>
+      <w:r>
+        <w:rPr>
+          <w:bCs/>
+          <w:b/>
+        </w:rPr>
+        <w:t xml:space="preserve">3.</w:t>
+      </w:r>
+      <w:r>
+        <w:t xml:space="preserve"> Proces powrotu do gry w badanej populacji ma w przeważającej mierze charakter nieobiektywizowany i pozamedyczny – 76,8% zawodników nie zostało poddanych żadnym testom funkcjonalnym, a 58,9% podjęło ostateczną decyzję o powrocie samodzielnie, co w połączeniu z wykazanym istotnym związkiem etapowości powrotu i liczby urazów z poziomem kinezjofobii (odpowiednio p = 0,014 i p = 0,003) potwierdza hipotezę H3 i wskazuje na pilną potrzebę wdrożenia modelu </w:t>
+      </w:r>
+      <w:r>
+        <w:rPr>
+          <w:iCs/>
+          <w:i/>
+        </w:rPr>
+        <w:t xml:space="preserve">criteria-based Return to Play</w:t>
+      </w:r>
+      <w:r>
+        <w:t xml:space="preserve"> wraz z przesiewową oceną psychologicznej gotowości do powrotu do sportu.</w:t>
+      </w:r>
+    </w:p>
+    <w:p>
+      <w:pPr>
+        <w:pStyle w:val="BodyText"/>
+      </w:pPr>
+      <w:r>
+        <w:rPr>
+          <w:bCs/>
+          <w:b/>
+        </w:rPr>
+        <w:t xml:space="preserve">4.</w:t>
+      </w:r>
+      <w:r>
+        <w:t xml:space="preserve"> Nie wykazano istotnych statystycznie zależności między mechanizmem powstania urazu a rodzajem uszkodzonej tkanki (H2) ani między obecnością profilaktyki klubowej lub indywidualnej a liczbą doznanych urazów (H4), przy czym brak potwierdzenia hipotezy H4 należy interpretować w kontekście przekrojowego charakteru badania, ryzyka odwrotnej przyczynowości oraz niejednorodności jakościowej deklarowanych programów profilaktycznych, nie zaś jako dowód nieskuteczności prewencji jako takiej.</w:t>
+      </w:r>
+    </w:p>
+    <w:p>
+      <w:pPr>
+        <w:pStyle w:val="BodyText"/>
+      </w:pPr>
+      <w:r>
+        <w:rPr>
+          <w:bCs/>
+          <w:b/>
+        </w:rPr>
+        <w:t xml:space="preserve">5.</w:t>
+      </w:r>
+      <w:r>
+        <w:t xml:space="preserve"> Samoocena wiedzy zawodnika na temat prewencji urazów istotnie koreluje z rzeczywistym zakresem stosowanej profilaktyki aktywnej, w tym w szczególności z wykorzystaniem treningu ekscentrycznego/izometrycznego (wzrost z 6,9% do 52,4%; p = 0,002), co potwierdza hipotezę H5 i wskazuje edukację zawodników jako kluczowe, niskokosztowe narzędzie zwiększające realne wdrożenie metod prewencyjnych o udokumentowanej skuteczności biomechanicznej.</w:t>
+      </w:r>
+    </w:p>
+    <w:p>
+      <w:pPr>
+        <w:pStyle w:val="BodyText"/>
+      </w:pPr>
+      <w:r>
+        <w:rPr>
+          <w:bCs/>
+          <w:b/>
+        </w:rPr>
+        <w:t xml:space="preserve">6.</w:t>
+      </w:r>
+      <w:r>
+        <w:t xml:space="preserve"> Na podstawie zidentyfikowanych deficytów opracowano trzy modelowe, czterofazowe protokoły usprawniania (staw skokowy, staw kolanowy/ACL, mięśnie kulszowo-goleniowe), oparte na zasadzie progresji sterowanej obiektywnymi kryteriami funkcjonalnymi i psychologicznymi, a nie wyłącznie czasem od urazu – stanowiące praktyczną, aplikacyjną odpowiedź na wykazane w badaniu własnym braki w zakresie obiektywizacji procesu Return to Play oraz rekomendację wdrożeniową możliwą do zastosowania przede wszystkim na poziomie amatorskim i półprofesjonalnym piłki nożnej, dominującym w badanej próbie.</w:t>
+      </w:r>
+    </w:p>
     <w:bookmarkStart w:id="47" w:name="bibliografia"/>
     <w:p>
       <w:pPr>
@@ -1531,6 +2287,240 @@
       </w:r>
       <w:r>
         <w:t xml:space="preserve">, 13. doi: 10.7759/cureus.17228</w:t>
+      </w:r>
+    </w:p>
+    <w:p>
+      <w:pPr>
+        <w:pStyle w:val="BodyText"/>
+      </w:pPr>
+      <w:r>
+        <w:t xml:space="preserve">[QQ] Ekstrand, J., Hägglund, M., &amp; Waldén, M. (2011). Injury incidence and injury patterns in professional football: the UEFA injury study. </w:t>
+      </w:r>
+      <w:r>
+        <w:rPr>
+          <w:iCs/>
+          <w:i/>
+        </w:rPr>
+        <w:t xml:space="preserve">Br J Sports Med</w:t>
+      </w:r>
+      <w:r>
+        <w:t xml:space="preserve">, 45(7), 553–558.</w:t>
+      </w:r>
+    </w:p>
+    <w:p>
+      <w:pPr>
+        <w:pStyle w:val="BodyText"/>
+      </w:pPr>
+      <w:r>
+        <w:t xml:space="preserve">[RR] Dubois, B., &amp; Esculier, J.-F. (2020). Soft-tissue injuries simply need PEACE and LOVE. </w:t>
+      </w:r>
+      <w:r>
+        <w:rPr>
+          <w:iCs/>
+          <w:i/>
+        </w:rPr>
+        <w:t xml:space="preserve">Br J Sports Med</w:t>
+      </w:r>
+      <w:r>
+        <w:t xml:space="preserve">, 54(2), 72–73. doi: 10.1136/bjsports-2019-101253</w:t>
+      </w:r>
+    </w:p>
+    <w:p>
+      <w:pPr>
+        <w:pStyle w:val="BodyText"/>
+      </w:pPr>
+      <w:r>
+        <w:t xml:space="preserve">[SS] Vuurberg, G., Hoorntje, A., Wink, L. M., i wsp. (2018). Diagnosis, treatment and prevention of ankle sprains: update of an evidence-based clinical guideline. </w:t>
+      </w:r>
+      <w:r>
+        <w:rPr>
+          <w:iCs/>
+          <w:i/>
+        </w:rPr>
+        <w:t xml:space="preserve">Br J Sports Med</w:t>
+      </w:r>
+      <w:r>
+        <w:t xml:space="preserve">, 52(15), 956. doi: 10.1136/bjsports-2017-098106</w:t>
+      </w:r>
+    </w:p>
+    <w:p>
+      <w:pPr>
+        <w:pStyle w:val="BodyText"/>
+      </w:pPr>
+      <w:r>
+        <w:t xml:space="preserve">[TT] van Melick, N., van Cingel, R. E. H., Brooijmans, F., i wsp. (2016). Evidence-based clinical practice update: practice guidelines for anterior cruciate ligament rehabilitation based on a systematic review and multidisciplinary consensus. </w:t>
+      </w:r>
+      <w:r>
+        <w:rPr>
+          <w:iCs/>
+          <w:i/>
+        </w:rPr>
+        <w:t xml:space="preserve">Br J Sports Med</w:t>
+      </w:r>
+      <w:r>
+        <w:t xml:space="preserve">, 50(24), 1506–1515. doi: 10.1136/bjsports-2015-095898</w:t>
+      </w:r>
+    </w:p>
+    <w:p>
+      <w:pPr>
+        <w:pStyle w:val="BodyText"/>
+      </w:pPr>
+      <w:r>
+        <w:t xml:space="preserve">[UU] Grindem, H., Snyder-Mackler, L., Moksnes, H., Engebretsen, L., &amp; Risberg, M. A. (2016). Simple decision rules can reduce reinjury risk by 84% after ACL reconstruction: the Delaware-Oslo ACL cohort study. </w:t>
+      </w:r>
+      <w:r>
+        <w:rPr>
+          <w:iCs/>
+          <w:i/>
+        </w:rPr>
+        <w:t xml:space="preserve">Br J Sports Med</w:t>
+      </w:r>
+      <w:r>
+        <w:t xml:space="preserve">, 50(13), 804–808.</w:t>
+      </w:r>
+    </w:p>
+    <w:p>
+      <w:pPr>
+        <w:pStyle w:val="BodyText"/>
+      </w:pPr>
+      <w:r>
+        <w:t xml:space="preserve">[VV] Webster, K. E., Feller, J. A., &amp; Lambros, C. (2008). Development and preliminary validation of a scale to measure the psychological impact of returning to sport following anterior cruciate ligament reconstruction surgery. </w:t>
+      </w:r>
+      <w:r>
+        <w:rPr>
+          <w:iCs/>
+          <w:i/>
+        </w:rPr>
+        <w:t xml:space="preserve">Phys Ther Sport</w:t>
+      </w:r>
+      <w:r>
+        <w:t xml:space="preserve">, 9(1), 9–15. doi: 10.1016/j.ptsp.2007.09.003</w:t>
+      </w:r>
+    </w:p>
+    <w:p>
+      <w:pPr>
+        <w:pStyle w:val="BodyText"/>
+      </w:pPr>
+      <w:r>
+        <w:t xml:space="preserve">[WW] Miller, R. P., Kori, S., &amp; Todd, D. (1991). The Tampa Scale: a measure of kinesiophobia. </w:t>
+      </w:r>
+      <w:r>
+        <w:rPr>
+          <w:iCs/>
+          <w:i/>
+        </w:rPr>
+        <w:t xml:space="preserve">Clinical Journal of Pain</w:t>
+      </w:r>
+      <w:r>
+        <w:t xml:space="preserve">, 7(1), 51–52.</w:t>
+      </w:r>
+    </w:p>
+    <w:p>
+      <w:pPr>
+        <w:pStyle w:val="BodyText"/>
+      </w:pPr>
+      <w:r>
+        <w:t xml:space="preserve">[XX] Plisky, P. J., Gorman, P. P., Butler, R. J., Kiesel, K. B., Underwood, F. B., &amp; Elkins, B. (2009). The reliability of an instrumented device for measuring components of the star excursion balance test. </w:t>
+      </w:r>
+      <w:r>
+        <w:rPr>
+          <w:iCs/>
+          <w:i/>
+        </w:rPr>
+        <w:t xml:space="preserve">North American Journal of Sports Physical Therapy</w:t>
+      </w:r>
+      <w:r>
+        <w:t xml:space="preserve">, 4(2), 92–99.</w:t>
+      </w:r>
+    </w:p>
+    <w:p>
+      <w:pPr>
+        <w:pStyle w:val="BodyText"/>
+      </w:pPr>
+      <w:r>
+        <w:t xml:space="preserve">[YY] Heiderscheit, B. C., Sherry, M. A., Silder, A., Chumanov, E. S., &amp; Thelen, D. G. (2010). Hamstring strain injuries: recommendations for diagnosis, rehabilitation, and injury prevention. </w:t>
+      </w:r>
+      <w:r>
+        <w:rPr>
+          <w:iCs/>
+          <w:i/>
+        </w:rPr>
+        <w:t xml:space="preserve">Journal of Orthopaedic &amp; Sports Physical Therapy</w:t>
+      </w:r>
+      <w:r>
+        <w:t xml:space="preserve">, 40(2), 67–81. doi: 10.2519/jospt.2010.3047</w:t>
+      </w:r>
+    </w:p>
+    <w:p>
+      <w:pPr>
+        <w:pStyle w:val="BodyText"/>
+      </w:pPr>
+      <w:r>
+        <w:t xml:space="preserve">[ZZ] Petersen, J., Thorborg, K., Nielsen, M. B., Budtz-Jørgensen, E., &amp; Hölmich, P. (2011). Preventive effect of eccentric training on acute hamstring injuries in men's soccer: a cluster-randomized controlled trial. </w:t>
+      </w:r>
+      <w:r>
+        <w:rPr>
+          <w:iCs/>
+          <w:i/>
+        </w:rPr>
+        <w:t xml:space="preserve">American Journal of Sports Medicine</w:t>
+      </w:r>
+      <w:r>
+        <w:t xml:space="preserve">, 39(11), 2296–2303.</w:t>
+      </w:r>
+    </w:p>
+    <w:p>
+      <w:pPr>
+        <w:pStyle w:val="BodyText"/>
+      </w:pPr>
+      <w:r>
+        <w:t xml:space="preserve">[AB] Askling, C. M., Tengvar, M., Tarassova, O., &amp; Thorstensson, A. (2014). Acute hamstring injuries in Swedish elite sprinters and jumpers: a prospective randomised controlled clinical trial comparing two rehabilitation protocols. </w:t>
+      </w:r>
+      <w:r>
+        <w:rPr>
+          <w:iCs/>
+          <w:i/>
+        </w:rPr>
+        <w:t xml:space="preserve">Br J Sports Med</w:t>
+      </w:r>
+      <w:r>
+        <w:t xml:space="preserve">, 48(7), 532–539. doi: 10.1136/bjsports-2013-093214</w:t>
+      </w:r>
+    </w:p>
+    <w:p>
+      <w:pPr>
+        <w:pStyle w:val="BodyText"/>
+      </w:pPr>
+      <w:r>
+        <w:t xml:space="preserve">[AC] Ardern, C. L., Glasgow, P., Schneiders, A., i wsp. (2016). 2016 Consensus statement on return to sport from the First World Congress in Sports Physical Therapy, Bern. </w:t>
+      </w:r>
+      <w:r>
+        <w:rPr>
+          <w:iCs/>
+          <w:i/>
+        </w:rPr>
+        <w:t xml:space="preserve">Br J Sports Med</w:t>
+      </w:r>
+      <w:r>
+        <w:t xml:space="preserve">, 50(14), 853–864. doi: 10.1136/bjsports-2016-096278</w:t>
+      </w:r>
+    </w:p>
+    <w:p>
+      <w:pPr>
+        <w:pStyle w:val="BodyText"/>
+      </w:pPr>
+      <w:r>
+        <w:t xml:space="preserve">[AD] Creighton, D. W., Shrier, I., Shultz, R., Meeuwisse, W. H., &amp; Matheson, G. O. (2010). Return-to-play in sport: a decision-based model. </w:t>
+      </w:r>
+      <w:r>
+        <w:rPr>
+          <w:iCs/>
+          <w:i/>
+        </w:rPr>
+        <w:t xml:space="preserve">Clinical Journal of Sport Medicine</w:t>
+      </w:r>
+      <w:r>
+        <w:t xml:space="preserve">, 20(5), 379–385.</w:t>
       </w:r>
     </w:p>
     <w:p>

</xml_diff>